<commit_message>
Paket za odvetnika: trije ločeni Wordi (vprašanja, pogoji, politika)
Po vzorcu prejšnjega pošiljanja, da gre vsak dokument lahko posebej.

Co-Authored-By: Claude Fable 5.1 <noreply@anthropic.com>
</commit_message>
<xml_diff>
--- a/docs/odvetnik-paket/2026-09-04/Pinart-Flow-gradivo-za-pravni-pregled-2026-09-04.docx
+++ b/docs/odvetnik-paket/2026-09-04/Pinart-Flow-gradivo-za-pravni-pregled-2026-09-04.docx
@@ -1343,8 +1343,13 @@
     <w:p>
       <w:pPr>
         <w:spacing w:after="120"/>
-      </w:pPr>
-      <w:r>
+        <w:keepNext/>
+      </w:pPr>
+      <w:r>
+        <w:rPr>
+          <w:b/>
+          <w:sz w:val="22"/>
+        </w:rPr>
         <w:t xml:space="preserve">POJMI</w:t>
       </w:r>
     </w:p>
@@ -3287,9 +3292,14 @@
     </w:p>
     <w:p>
       <w:pPr>
-        <w:spacing w:after="120"/>
-      </w:pPr>
-      <w:r>
+        <w:spacing w:after="160"/>
+        <w:keepNext/>
+      </w:pPr>
+      <w:r>
+        <w:rPr>
+          <w:b/>
+          <w:sz w:val="26"/>
+        </w:rPr>
         <w:t xml:space="preserve">MANJKA — predlog treh odstavkov (prosim za popravek; glej vprašanja 29, 30 in 31):</w:t>
       </w:r>
     </w:p>

</xml_diff>